<commit_message>
daylis 12 sprint 1
</commit_message>
<xml_diff>
--- a/Fase dos/Documentacion Scrum/Dailys/Dailys 11- Sprint 1.docx
+++ b/Fase dos/Documentacion Scrum/Dailys/Dailys 11- Sprint 1.docx
@@ -111,13 +111,8 @@
           <w:numId w:val="8"/>
         </w:numPr>
       </w:pPr>
-      <w:proofErr w:type="spellStart"/>
       <w:r>
-        <w:t>Dailys</w:t>
-      </w:r>
-      <w:proofErr w:type="spellEnd"/>
-      <w:r>
-        <w:t xml:space="preserve"> </w:t>
+        <w:t xml:space="preserve">Dailys </w:t>
       </w:r>
       <w:r>
         <w:t>1</w:t>
@@ -162,15 +157,7 @@
         <w:t>Israel Muñoz</w:t>
       </w:r>
       <w:r>
-        <w:t xml:space="preserve"> (</w:t>
-      </w:r>
-      <w:proofErr w:type="spellStart"/>
-      <w:r>
-        <w:t>Product</w:t>
-      </w:r>
-      <w:proofErr w:type="spellEnd"/>
-      <w:r>
-        <w:t xml:space="preserve"> Owner / desarrollador)</w:t>
+        <w:t xml:space="preserve"> (Product Owner / desarrollador)</w:t>
       </w:r>
     </w:p>
     <w:p>
@@ -234,13 +221,13 @@
     <w:p>
       <w:pPr>
         <w:pStyle w:val="Prrafodelista"/>
-        <w:ind w:left="1428"/>
+        <w:numPr>
+          <w:ilvl w:val="0"/>
+          <w:numId w:val="20"/>
+        </w:numPr>
       </w:pPr>
       <w:r>
-        <w:t>Desarrollo de la H.U -</w:t>
-      </w:r>
-      <w:r>
-        <w:t>Como Administrador necesito registrar y gestionar en el sistema: comunidades, edificios y unidades.</w:t>
+        <w:t>Se concluye la H.U</w:t>
       </w:r>
     </w:p>
     <w:p>
@@ -269,22 +256,29 @@
     <w:p>
       <w:pPr>
         <w:pStyle w:val="Prrafodelista"/>
-      </w:pPr>
-      <w:r>
-        <w:t>Sigue en desarrollo las historias de usuario:</w:t>
-      </w:r>
-    </w:p>
-    <w:p>
-      <w:pPr>
-        <w:pStyle w:val="Prrafodelista"/>
         <w:numPr>
           <w:ilvl w:val="0"/>
           <w:numId w:val="11"/>
         </w:numPr>
       </w:pPr>
       <w:r>
+        <w:t>Desarrollo H.</w:t>
+      </w:r>
+      <w:r>
+        <w:t>U</w:t>
+      </w:r>
+      <w:r>
+        <w:t xml:space="preserve"> </w:t>
+      </w:r>
+      <w:r>
         <w:t>Como Administrador necesito registrar y gestionar en el sistema: comunidades, edificios y unidades.</w:t>
       </w:r>
+    </w:p>
+    <w:p>
+      <w:pPr>
+        <w:pStyle w:val="Prrafodelista"/>
+        <w:ind w:left="1440"/>
+      </w:pPr>
     </w:p>
     <w:p>
       <w:pPr>
@@ -708,6 +702,119 @@
     </w:lvl>
   </w:abstractNum>
   <w:abstractNum w:abstractNumId="1" w15:restartNumberingAfterBreak="0">
+    <w:nsid w:val="083920DE"/>
+    <w:multiLevelType w:val="hybridMultilevel"/>
+    <w:tmpl w:val="50462176"/>
+    <w:lvl w:ilvl="0" w:tplc="340A0001">
+      <w:start w:val="1"/>
+      <w:numFmt w:val="bullet"/>
+      <w:lvlText w:val=""/>
+      <w:lvlJc w:val="left"/>
+      <w:pPr>
+        <w:ind w:left="2148" w:hanging="360"/>
+      </w:pPr>
+      <w:rPr>
+        <w:rFonts w:ascii="Symbol" w:hAnsi="Symbol" w:hint="default"/>
+      </w:rPr>
+    </w:lvl>
+    <w:lvl w:ilvl="1" w:tplc="340A0003" w:tentative="1">
+      <w:start w:val="1"/>
+      <w:numFmt w:val="bullet"/>
+      <w:lvlText w:val="o"/>
+      <w:lvlJc w:val="left"/>
+      <w:pPr>
+        <w:ind w:left="2868" w:hanging="360"/>
+      </w:pPr>
+      <w:rPr>
+        <w:rFonts w:ascii="Courier New" w:hAnsi="Courier New" w:cs="Courier New" w:hint="default"/>
+      </w:rPr>
+    </w:lvl>
+    <w:lvl w:ilvl="2" w:tplc="340A0005" w:tentative="1">
+      <w:start w:val="1"/>
+      <w:numFmt w:val="bullet"/>
+      <w:lvlText w:val=""/>
+      <w:lvlJc w:val="left"/>
+      <w:pPr>
+        <w:ind w:left="3588" w:hanging="360"/>
+      </w:pPr>
+      <w:rPr>
+        <w:rFonts w:ascii="Wingdings" w:hAnsi="Wingdings" w:hint="default"/>
+      </w:rPr>
+    </w:lvl>
+    <w:lvl w:ilvl="3" w:tplc="340A0001" w:tentative="1">
+      <w:start w:val="1"/>
+      <w:numFmt w:val="bullet"/>
+      <w:lvlText w:val=""/>
+      <w:lvlJc w:val="left"/>
+      <w:pPr>
+        <w:ind w:left="4308" w:hanging="360"/>
+      </w:pPr>
+      <w:rPr>
+        <w:rFonts w:ascii="Symbol" w:hAnsi="Symbol" w:hint="default"/>
+      </w:rPr>
+    </w:lvl>
+    <w:lvl w:ilvl="4" w:tplc="340A0003" w:tentative="1">
+      <w:start w:val="1"/>
+      <w:numFmt w:val="bullet"/>
+      <w:lvlText w:val="o"/>
+      <w:lvlJc w:val="left"/>
+      <w:pPr>
+        <w:ind w:left="5028" w:hanging="360"/>
+      </w:pPr>
+      <w:rPr>
+        <w:rFonts w:ascii="Courier New" w:hAnsi="Courier New" w:cs="Courier New" w:hint="default"/>
+      </w:rPr>
+    </w:lvl>
+    <w:lvl w:ilvl="5" w:tplc="340A0005" w:tentative="1">
+      <w:start w:val="1"/>
+      <w:numFmt w:val="bullet"/>
+      <w:lvlText w:val=""/>
+      <w:lvlJc w:val="left"/>
+      <w:pPr>
+        <w:ind w:left="5748" w:hanging="360"/>
+      </w:pPr>
+      <w:rPr>
+        <w:rFonts w:ascii="Wingdings" w:hAnsi="Wingdings" w:hint="default"/>
+      </w:rPr>
+    </w:lvl>
+    <w:lvl w:ilvl="6" w:tplc="340A0001" w:tentative="1">
+      <w:start w:val="1"/>
+      <w:numFmt w:val="bullet"/>
+      <w:lvlText w:val=""/>
+      <w:lvlJc w:val="left"/>
+      <w:pPr>
+        <w:ind w:left="6468" w:hanging="360"/>
+      </w:pPr>
+      <w:rPr>
+        <w:rFonts w:ascii="Symbol" w:hAnsi="Symbol" w:hint="default"/>
+      </w:rPr>
+    </w:lvl>
+    <w:lvl w:ilvl="7" w:tplc="340A0003" w:tentative="1">
+      <w:start w:val="1"/>
+      <w:numFmt w:val="bullet"/>
+      <w:lvlText w:val="o"/>
+      <w:lvlJc w:val="left"/>
+      <w:pPr>
+        <w:ind w:left="7188" w:hanging="360"/>
+      </w:pPr>
+      <w:rPr>
+        <w:rFonts w:ascii="Courier New" w:hAnsi="Courier New" w:cs="Courier New" w:hint="default"/>
+      </w:rPr>
+    </w:lvl>
+    <w:lvl w:ilvl="8" w:tplc="340A0005" w:tentative="1">
+      <w:start w:val="1"/>
+      <w:numFmt w:val="bullet"/>
+      <w:lvlText w:val=""/>
+      <w:lvlJc w:val="left"/>
+      <w:pPr>
+        <w:ind w:left="7908" w:hanging="360"/>
+      </w:pPr>
+      <w:rPr>
+        <w:rFonts w:ascii="Wingdings" w:hAnsi="Wingdings" w:hint="default"/>
+      </w:rPr>
+    </w:lvl>
+  </w:abstractNum>
+  <w:abstractNum w:abstractNumId="2" w15:restartNumberingAfterBreak="0">
     <w:nsid w:val="08FE22A9"/>
     <w:multiLevelType w:val="hybridMultilevel"/>
     <w:tmpl w:val="C868F8B2"/>
@@ -820,7 +927,120 @@
       </w:rPr>
     </w:lvl>
   </w:abstractNum>
-  <w:abstractNum w:abstractNumId="2" w15:restartNumberingAfterBreak="0">
+  <w:abstractNum w:abstractNumId="3" w15:restartNumberingAfterBreak="0">
+    <w:nsid w:val="1C69210C"/>
+    <w:multiLevelType w:val="hybridMultilevel"/>
+    <w:tmpl w:val="FD2C3DA2"/>
+    <w:lvl w:ilvl="0" w:tplc="340A0001">
+      <w:start w:val="1"/>
+      <w:numFmt w:val="bullet"/>
+      <w:lvlText w:val=""/>
+      <w:lvlJc w:val="left"/>
+      <w:pPr>
+        <w:ind w:left="1776" w:hanging="360"/>
+      </w:pPr>
+      <w:rPr>
+        <w:rFonts w:ascii="Symbol" w:hAnsi="Symbol" w:hint="default"/>
+      </w:rPr>
+    </w:lvl>
+    <w:lvl w:ilvl="1" w:tplc="340A0003" w:tentative="1">
+      <w:start w:val="1"/>
+      <w:numFmt w:val="bullet"/>
+      <w:lvlText w:val="o"/>
+      <w:lvlJc w:val="left"/>
+      <w:pPr>
+        <w:ind w:left="2496" w:hanging="360"/>
+      </w:pPr>
+      <w:rPr>
+        <w:rFonts w:ascii="Courier New" w:hAnsi="Courier New" w:cs="Courier New" w:hint="default"/>
+      </w:rPr>
+    </w:lvl>
+    <w:lvl w:ilvl="2" w:tplc="340A0005" w:tentative="1">
+      <w:start w:val="1"/>
+      <w:numFmt w:val="bullet"/>
+      <w:lvlText w:val=""/>
+      <w:lvlJc w:val="left"/>
+      <w:pPr>
+        <w:ind w:left="3216" w:hanging="360"/>
+      </w:pPr>
+      <w:rPr>
+        <w:rFonts w:ascii="Wingdings" w:hAnsi="Wingdings" w:hint="default"/>
+      </w:rPr>
+    </w:lvl>
+    <w:lvl w:ilvl="3" w:tplc="340A0001" w:tentative="1">
+      <w:start w:val="1"/>
+      <w:numFmt w:val="bullet"/>
+      <w:lvlText w:val=""/>
+      <w:lvlJc w:val="left"/>
+      <w:pPr>
+        <w:ind w:left="3936" w:hanging="360"/>
+      </w:pPr>
+      <w:rPr>
+        <w:rFonts w:ascii="Symbol" w:hAnsi="Symbol" w:hint="default"/>
+      </w:rPr>
+    </w:lvl>
+    <w:lvl w:ilvl="4" w:tplc="340A0003" w:tentative="1">
+      <w:start w:val="1"/>
+      <w:numFmt w:val="bullet"/>
+      <w:lvlText w:val="o"/>
+      <w:lvlJc w:val="left"/>
+      <w:pPr>
+        <w:ind w:left="4656" w:hanging="360"/>
+      </w:pPr>
+      <w:rPr>
+        <w:rFonts w:ascii="Courier New" w:hAnsi="Courier New" w:cs="Courier New" w:hint="default"/>
+      </w:rPr>
+    </w:lvl>
+    <w:lvl w:ilvl="5" w:tplc="340A0005" w:tentative="1">
+      <w:start w:val="1"/>
+      <w:numFmt w:val="bullet"/>
+      <w:lvlText w:val=""/>
+      <w:lvlJc w:val="left"/>
+      <w:pPr>
+        <w:ind w:left="5376" w:hanging="360"/>
+      </w:pPr>
+      <w:rPr>
+        <w:rFonts w:ascii="Wingdings" w:hAnsi="Wingdings" w:hint="default"/>
+      </w:rPr>
+    </w:lvl>
+    <w:lvl w:ilvl="6" w:tplc="340A0001" w:tentative="1">
+      <w:start w:val="1"/>
+      <w:numFmt w:val="bullet"/>
+      <w:lvlText w:val=""/>
+      <w:lvlJc w:val="left"/>
+      <w:pPr>
+        <w:ind w:left="6096" w:hanging="360"/>
+      </w:pPr>
+      <w:rPr>
+        <w:rFonts w:ascii="Symbol" w:hAnsi="Symbol" w:hint="default"/>
+      </w:rPr>
+    </w:lvl>
+    <w:lvl w:ilvl="7" w:tplc="340A0003" w:tentative="1">
+      <w:start w:val="1"/>
+      <w:numFmt w:val="bullet"/>
+      <w:lvlText w:val="o"/>
+      <w:lvlJc w:val="left"/>
+      <w:pPr>
+        <w:ind w:left="6816" w:hanging="360"/>
+      </w:pPr>
+      <w:rPr>
+        <w:rFonts w:ascii="Courier New" w:hAnsi="Courier New" w:cs="Courier New" w:hint="default"/>
+      </w:rPr>
+    </w:lvl>
+    <w:lvl w:ilvl="8" w:tplc="340A0005" w:tentative="1">
+      <w:start w:val="1"/>
+      <w:numFmt w:val="bullet"/>
+      <w:lvlText w:val=""/>
+      <w:lvlJc w:val="left"/>
+      <w:pPr>
+        <w:ind w:left="7536" w:hanging="360"/>
+      </w:pPr>
+      <w:rPr>
+        <w:rFonts w:ascii="Wingdings" w:hAnsi="Wingdings" w:hint="default"/>
+      </w:rPr>
+    </w:lvl>
+  </w:abstractNum>
+  <w:abstractNum w:abstractNumId="4" w15:restartNumberingAfterBreak="0">
     <w:nsid w:val="227648FF"/>
     <w:multiLevelType w:val="hybridMultilevel"/>
     <w:tmpl w:val="422C19FE"/>
@@ -933,7 +1153,7 @@
       </w:rPr>
     </w:lvl>
   </w:abstractNum>
-  <w:abstractNum w:abstractNumId="3" w15:restartNumberingAfterBreak="0">
+  <w:abstractNum w:abstractNumId="5" w15:restartNumberingAfterBreak="0">
     <w:nsid w:val="24FF7F38"/>
     <w:multiLevelType w:val="hybridMultilevel"/>
     <w:tmpl w:val="B748E918"/>
@@ -1046,7 +1266,7 @@
       </w:rPr>
     </w:lvl>
   </w:abstractNum>
-  <w:abstractNum w:abstractNumId="4" w15:restartNumberingAfterBreak="0">
+  <w:abstractNum w:abstractNumId="6" w15:restartNumberingAfterBreak="0">
     <w:nsid w:val="25C405F1"/>
     <w:multiLevelType w:val="hybridMultilevel"/>
     <w:tmpl w:val="5CC45462"/>
@@ -1159,7 +1379,120 @@
       </w:rPr>
     </w:lvl>
   </w:abstractNum>
-  <w:abstractNum w:abstractNumId="5" w15:restartNumberingAfterBreak="0">
+  <w:abstractNum w:abstractNumId="7" w15:restartNumberingAfterBreak="0">
+    <w:nsid w:val="26C20DDF"/>
+    <w:multiLevelType w:val="hybridMultilevel"/>
+    <w:tmpl w:val="A0BCC08E"/>
+    <w:lvl w:ilvl="0" w:tplc="340A0001">
+      <w:start w:val="1"/>
+      <w:numFmt w:val="bullet"/>
+      <w:lvlText w:val=""/>
+      <w:lvlJc w:val="left"/>
+      <w:pPr>
+        <w:ind w:left="1776" w:hanging="360"/>
+      </w:pPr>
+      <w:rPr>
+        <w:rFonts w:ascii="Symbol" w:hAnsi="Symbol" w:hint="default"/>
+      </w:rPr>
+    </w:lvl>
+    <w:lvl w:ilvl="1" w:tplc="340A0003" w:tentative="1">
+      <w:start w:val="1"/>
+      <w:numFmt w:val="bullet"/>
+      <w:lvlText w:val="o"/>
+      <w:lvlJc w:val="left"/>
+      <w:pPr>
+        <w:ind w:left="2496" w:hanging="360"/>
+      </w:pPr>
+      <w:rPr>
+        <w:rFonts w:ascii="Courier New" w:hAnsi="Courier New" w:cs="Courier New" w:hint="default"/>
+      </w:rPr>
+    </w:lvl>
+    <w:lvl w:ilvl="2" w:tplc="340A0005" w:tentative="1">
+      <w:start w:val="1"/>
+      <w:numFmt w:val="bullet"/>
+      <w:lvlText w:val=""/>
+      <w:lvlJc w:val="left"/>
+      <w:pPr>
+        <w:ind w:left="3216" w:hanging="360"/>
+      </w:pPr>
+      <w:rPr>
+        <w:rFonts w:ascii="Wingdings" w:hAnsi="Wingdings" w:hint="default"/>
+      </w:rPr>
+    </w:lvl>
+    <w:lvl w:ilvl="3" w:tplc="340A0001" w:tentative="1">
+      <w:start w:val="1"/>
+      <w:numFmt w:val="bullet"/>
+      <w:lvlText w:val=""/>
+      <w:lvlJc w:val="left"/>
+      <w:pPr>
+        <w:ind w:left="3936" w:hanging="360"/>
+      </w:pPr>
+      <w:rPr>
+        <w:rFonts w:ascii="Symbol" w:hAnsi="Symbol" w:hint="default"/>
+      </w:rPr>
+    </w:lvl>
+    <w:lvl w:ilvl="4" w:tplc="340A0003" w:tentative="1">
+      <w:start w:val="1"/>
+      <w:numFmt w:val="bullet"/>
+      <w:lvlText w:val="o"/>
+      <w:lvlJc w:val="left"/>
+      <w:pPr>
+        <w:ind w:left="4656" w:hanging="360"/>
+      </w:pPr>
+      <w:rPr>
+        <w:rFonts w:ascii="Courier New" w:hAnsi="Courier New" w:cs="Courier New" w:hint="default"/>
+      </w:rPr>
+    </w:lvl>
+    <w:lvl w:ilvl="5" w:tplc="340A0005" w:tentative="1">
+      <w:start w:val="1"/>
+      <w:numFmt w:val="bullet"/>
+      <w:lvlText w:val=""/>
+      <w:lvlJc w:val="left"/>
+      <w:pPr>
+        <w:ind w:left="5376" w:hanging="360"/>
+      </w:pPr>
+      <w:rPr>
+        <w:rFonts w:ascii="Wingdings" w:hAnsi="Wingdings" w:hint="default"/>
+      </w:rPr>
+    </w:lvl>
+    <w:lvl w:ilvl="6" w:tplc="340A0001" w:tentative="1">
+      <w:start w:val="1"/>
+      <w:numFmt w:val="bullet"/>
+      <w:lvlText w:val=""/>
+      <w:lvlJc w:val="left"/>
+      <w:pPr>
+        <w:ind w:left="6096" w:hanging="360"/>
+      </w:pPr>
+      <w:rPr>
+        <w:rFonts w:ascii="Symbol" w:hAnsi="Symbol" w:hint="default"/>
+      </w:rPr>
+    </w:lvl>
+    <w:lvl w:ilvl="7" w:tplc="340A0003" w:tentative="1">
+      <w:start w:val="1"/>
+      <w:numFmt w:val="bullet"/>
+      <w:lvlText w:val="o"/>
+      <w:lvlJc w:val="left"/>
+      <w:pPr>
+        <w:ind w:left="6816" w:hanging="360"/>
+      </w:pPr>
+      <w:rPr>
+        <w:rFonts w:ascii="Courier New" w:hAnsi="Courier New" w:cs="Courier New" w:hint="default"/>
+      </w:rPr>
+    </w:lvl>
+    <w:lvl w:ilvl="8" w:tplc="340A0005" w:tentative="1">
+      <w:start w:val="1"/>
+      <w:numFmt w:val="bullet"/>
+      <w:lvlText w:val=""/>
+      <w:lvlJc w:val="left"/>
+      <w:pPr>
+        <w:ind w:left="7536" w:hanging="360"/>
+      </w:pPr>
+      <w:rPr>
+        <w:rFonts w:ascii="Wingdings" w:hAnsi="Wingdings" w:hint="default"/>
+      </w:rPr>
+    </w:lvl>
+  </w:abstractNum>
+  <w:abstractNum w:abstractNumId="8" w15:restartNumberingAfterBreak="0">
     <w:nsid w:val="3A800526"/>
     <w:multiLevelType w:val="hybridMultilevel"/>
     <w:tmpl w:val="69A44368"/>
@@ -1272,7 +1605,7 @@
       </w:rPr>
     </w:lvl>
   </w:abstractNum>
-  <w:abstractNum w:abstractNumId="6" w15:restartNumberingAfterBreak="0">
+  <w:abstractNum w:abstractNumId="9" w15:restartNumberingAfterBreak="0">
     <w:nsid w:val="3CEE4742"/>
     <w:multiLevelType w:val="hybridMultilevel"/>
     <w:tmpl w:val="05CE1C5C"/>
@@ -1385,7 +1718,7 @@
       </w:rPr>
     </w:lvl>
   </w:abstractNum>
-  <w:abstractNum w:abstractNumId="7" w15:restartNumberingAfterBreak="0">
+  <w:abstractNum w:abstractNumId="10" w15:restartNumberingAfterBreak="0">
     <w:nsid w:val="410517C7"/>
     <w:multiLevelType w:val="hybridMultilevel"/>
     <w:tmpl w:val="A508D126"/>
@@ -1498,7 +1831,7 @@
       </w:rPr>
     </w:lvl>
   </w:abstractNum>
-  <w:abstractNum w:abstractNumId="8" w15:restartNumberingAfterBreak="0">
+  <w:abstractNum w:abstractNumId="11" w15:restartNumberingAfterBreak="0">
     <w:nsid w:val="43F0234D"/>
     <w:multiLevelType w:val="hybridMultilevel"/>
     <w:tmpl w:val="D212728C"/>
@@ -1611,7 +1944,7 @@
       </w:rPr>
     </w:lvl>
   </w:abstractNum>
-  <w:abstractNum w:abstractNumId="9" w15:restartNumberingAfterBreak="0">
+  <w:abstractNum w:abstractNumId="12" w15:restartNumberingAfterBreak="0">
     <w:nsid w:val="45C013EA"/>
     <w:multiLevelType w:val="hybridMultilevel"/>
     <w:tmpl w:val="45925B04"/>
@@ -1724,7 +2057,7 @@
       </w:rPr>
     </w:lvl>
   </w:abstractNum>
-  <w:abstractNum w:abstractNumId="10" w15:restartNumberingAfterBreak="0">
+  <w:abstractNum w:abstractNumId="13" w15:restartNumberingAfterBreak="0">
     <w:nsid w:val="479D2775"/>
     <w:multiLevelType w:val="hybridMultilevel"/>
     <w:tmpl w:val="74BCE514"/>
@@ -1813,7 +2146,7 @@
       </w:pPr>
     </w:lvl>
   </w:abstractNum>
-  <w:abstractNum w:abstractNumId="11" w15:restartNumberingAfterBreak="0">
+  <w:abstractNum w:abstractNumId="14" w15:restartNumberingAfterBreak="0">
     <w:nsid w:val="54CF6383"/>
     <w:multiLevelType w:val="multilevel"/>
     <w:tmpl w:val="B4C692C6"/>
@@ -1962,7 +2295,7 @@
       </w:rPr>
     </w:lvl>
   </w:abstractNum>
-  <w:abstractNum w:abstractNumId="12" w15:restartNumberingAfterBreak="0">
+  <w:abstractNum w:abstractNumId="15" w15:restartNumberingAfterBreak="0">
     <w:nsid w:val="57A05136"/>
     <w:multiLevelType w:val="hybridMultilevel"/>
     <w:tmpl w:val="E23EE3F0"/>
@@ -2075,7 +2408,7 @@
       </w:rPr>
     </w:lvl>
   </w:abstractNum>
-  <w:abstractNum w:abstractNumId="13" w15:restartNumberingAfterBreak="0">
+  <w:abstractNum w:abstractNumId="16" w15:restartNumberingAfterBreak="0">
     <w:nsid w:val="610A0626"/>
     <w:multiLevelType w:val="hybridMultilevel"/>
     <w:tmpl w:val="01C2B48C"/>
@@ -2188,7 +2521,7 @@
       </w:rPr>
     </w:lvl>
   </w:abstractNum>
-  <w:abstractNum w:abstractNumId="14" w15:restartNumberingAfterBreak="0">
+  <w:abstractNum w:abstractNumId="17" w15:restartNumberingAfterBreak="0">
     <w:nsid w:val="63476398"/>
     <w:multiLevelType w:val="hybridMultilevel"/>
     <w:tmpl w:val="FFD64270"/>
@@ -2301,7 +2634,7 @@
       </w:rPr>
     </w:lvl>
   </w:abstractNum>
-  <w:abstractNum w:abstractNumId="15" w15:restartNumberingAfterBreak="0">
+  <w:abstractNum w:abstractNumId="18" w15:restartNumberingAfterBreak="0">
     <w:nsid w:val="6D5C2985"/>
     <w:multiLevelType w:val="hybridMultilevel"/>
     <w:tmpl w:val="23B2D896"/>
@@ -2414,7 +2747,7 @@
       </w:rPr>
     </w:lvl>
   </w:abstractNum>
-  <w:abstractNum w:abstractNumId="16" w15:restartNumberingAfterBreak="0">
+  <w:abstractNum w:abstractNumId="19" w15:restartNumberingAfterBreak="0">
     <w:nsid w:val="76014403"/>
     <w:multiLevelType w:val="hybridMultilevel"/>
     <w:tmpl w:val="CA3A9AD0"/>
@@ -2528,55 +2861,64 @@
     </w:lvl>
   </w:abstractNum>
   <w:num w:numId="1" w16cid:durableId="1848516186">
+    <w:abstractNumId w:val="13"/>
+  </w:num>
+  <w:num w:numId="2" w16cid:durableId="290789372">
     <w:abstractNumId w:val="10"/>
   </w:num>
-  <w:num w:numId="2" w16cid:durableId="290789372">
-    <w:abstractNumId w:val="7"/>
-  </w:num>
   <w:num w:numId="3" w16cid:durableId="1214538422">
-    <w:abstractNumId w:val="12"/>
+    <w:abstractNumId w:val="15"/>
   </w:num>
   <w:num w:numId="4" w16cid:durableId="1792088254">
-    <w:abstractNumId w:val="15"/>
+    <w:abstractNumId w:val="18"/>
   </w:num>
   <w:num w:numId="5" w16cid:durableId="592981471">
     <w:abstractNumId w:val="0"/>
   </w:num>
   <w:num w:numId="6" w16cid:durableId="1186675827">
+    <w:abstractNumId w:val="11"/>
+  </w:num>
+  <w:num w:numId="7" w16cid:durableId="790634175">
+    <w:abstractNumId w:val="14"/>
+  </w:num>
+  <w:num w:numId="8" w16cid:durableId="1050491862">
     <w:abstractNumId w:val="8"/>
   </w:num>
-  <w:num w:numId="7" w16cid:durableId="790634175">
-    <w:abstractNumId w:val="11"/>
+  <w:num w:numId="9" w16cid:durableId="1835796930">
+    <w:abstractNumId w:val="2"/>
   </w:num>
-  <w:num w:numId="8" w16cid:durableId="1050491862">
+  <w:num w:numId="10" w16cid:durableId="1629969628">
+    <w:abstractNumId w:val="4"/>
+  </w:num>
+  <w:num w:numId="11" w16cid:durableId="250696478">
+    <w:abstractNumId w:val="17"/>
+  </w:num>
+  <w:num w:numId="12" w16cid:durableId="1398213079">
     <w:abstractNumId w:val="5"/>
   </w:num>
-  <w:num w:numId="9" w16cid:durableId="1835796930">
+  <w:num w:numId="13" w16cid:durableId="908345920">
+    <w:abstractNumId w:val="16"/>
+  </w:num>
+  <w:num w:numId="14" w16cid:durableId="1053578397">
+    <w:abstractNumId w:val="12"/>
+  </w:num>
+  <w:num w:numId="15" w16cid:durableId="1779517951">
+    <w:abstractNumId w:val="19"/>
+  </w:num>
+  <w:num w:numId="16" w16cid:durableId="211041257">
+    <w:abstractNumId w:val="6"/>
+  </w:num>
+  <w:num w:numId="17" w16cid:durableId="1687751217">
+    <w:abstractNumId w:val="9"/>
+  </w:num>
+  <w:num w:numId="18" w16cid:durableId="843545398">
     <w:abstractNumId w:val="1"/>
   </w:num>
-  <w:num w:numId="10" w16cid:durableId="1629969628">
-    <w:abstractNumId w:val="2"/>
-  </w:num>
-  <w:num w:numId="11" w16cid:durableId="250696478">
-    <w:abstractNumId w:val="14"/>
-  </w:num>
-  <w:num w:numId="12" w16cid:durableId="1398213079">
+  <w:num w:numId="19" w16cid:durableId="49887936">
     <w:abstractNumId w:val="3"/>
   </w:num>
-  <w:num w:numId="13" w16cid:durableId="908345920">
-    <w:abstractNumId w:val="13"/>
-  </w:num>
-  <w:num w:numId="14" w16cid:durableId="1053578397">
-    <w:abstractNumId w:val="9"/>
-  </w:num>
-  <w:num w:numId="15" w16cid:durableId="1779517951">
-    <w:abstractNumId w:val="16"/>
-  </w:num>
-  <w:num w:numId="16" w16cid:durableId="211041257">
-    <w:abstractNumId w:val="4"/>
-  </w:num>
-  <w:num w:numId="17" w16cid:durableId="1687751217">
-    <w:abstractNumId w:val="6"/>
+  <w:num w:numId="20" w16cid:durableId="1588998828">
+    <w:abstractNumId w:val="7"/>
   </w:num>
 </w:numbering>
 </file>

</xml_diff>